<commit_message>
style: remove Estado metadata headers across all modules
</commit_message>
<xml_diff>
--- a/TRABAJO_PRACTICO_DELITOS_INFORMATICOS.docx
+++ b/TRABAJO_PRACTICO_DELITOS_INFORMATICOS.docx
@@ -1928,25 +1928,6 @@
       <w:r>
         <w:rPr/>
         <w:t>)</w:t>
-      </w:r>
-    </w:p>
-    <w:p>
-      <w:pPr>
-        <w:pStyle w:val="BodyText"/>
-        <w:bidi w:val="0"/>
-        <w:spacing w:before="0" w:after="100"/>
-        <w:jc w:val="both"/>
-        <w:rPr/>
-      </w:pPr>
-      <w:r>
-        <w:rPr>
-          <w:rStyle w:val="Strong"/>
-        </w:rPr>
-        <w:t>Estado:</w:t>
-      </w:r>
-      <w:r>
-        <w:rPr/>
-        <w:t xml:space="preserve"> Completo / En revisión</w:t>
       </w:r>
     </w:p>
     <w:p>
@@ -2995,25 +2976,6 @@
       <w:r>
         <w:rPr/>
         <w:t>)</w:t>
-      </w:r>
-    </w:p>
-    <w:p>
-      <w:pPr>
-        <w:pStyle w:val="BodyText"/>
-        <w:bidi w:val="0"/>
-        <w:spacing w:before="0" w:after="100"/>
-        <w:jc w:val="both"/>
-        <w:rPr/>
-      </w:pPr>
-      <w:r>
-        <w:rPr>
-          <w:rStyle w:val="Strong"/>
-        </w:rPr>
-        <w:t>Estado:</w:t>
-      </w:r>
-      <w:r>
-        <w:rPr/>
-        <w:t xml:space="preserve"> Completo / En revisión</w:t>
       </w:r>
     </w:p>
     <w:p>
@@ -4850,25 +4812,6 @@
     </w:p>
     <w:p>
       <w:pPr>
-        <w:pStyle w:val="BodyText"/>
-        <w:bidi w:val="0"/>
-        <w:spacing w:before="0" w:after="100"/>
-        <w:jc w:val="both"/>
-        <w:rPr/>
-      </w:pPr>
-      <w:r>
-        <w:rPr>
-          <w:rStyle w:val="Strong"/>
-        </w:rPr>
-        <w:t>Estado:</w:t>
-      </w:r>
-      <w:r>
-        <w:rPr/>
-        <w:t xml:space="preserve"> Completo / En revisión</w:t>
-      </w:r>
-    </w:p>
-    <w:p>
-      <w:pPr>
         <w:pStyle w:val="HorizontalLine"/>
         <w:pBdr>
           <w:bottom w:val="double" w:sz="2" w:space="0" w:color="808080"/>
@@ -5606,25 +5549,6 @@
     </w:p>
     <w:p>
       <w:pPr>
-        <w:pStyle w:val="BodyText"/>
-        <w:bidi w:val="0"/>
-        <w:spacing w:before="0" w:after="100"/>
-        <w:jc w:val="both"/>
-        <w:rPr/>
-      </w:pPr>
-      <w:r>
-        <w:rPr>
-          <w:rStyle w:val="Strong"/>
-        </w:rPr>
-        <w:t>Estado:</w:t>
-      </w:r>
-      <w:r>
-        <w:rPr/>
-        <w:t xml:space="preserve"> Completo / Revisado</w:t>
-      </w:r>
-    </w:p>
-    <w:p>
-      <w:pPr>
         <w:pStyle w:val="HorizontalLine"/>
         <w:pBdr>
           <w:bottom w:val="double" w:sz="2" w:space="0" w:color="808080"/>
@@ -6830,25 +6754,6 @@
     </w:p>
     <w:p>
       <w:pPr>
-        <w:pStyle w:val="BodyText"/>
-        <w:bidi w:val="0"/>
-        <w:spacing w:before="0" w:after="100"/>
-        <w:jc w:val="both"/>
-        <w:rPr/>
-      </w:pPr>
-      <w:r>
-        <w:rPr>
-          <w:rStyle w:val="Strong"/>
-        </w:rPr>
-        <w:t>Estado:</w:t>
-      </w:r>
-      <w:r>
-        <w:rPr/>
-        <w:t xml:space="preserve"> Completo / En revisión</w:t>
-      </w:r>
-    </w:p>
-    <w:p>
-      <w:pPr>
         <w:pStyle w:val="HorizontalLine"/>
         <w:pBdr>
           <w:bottom w:val="double" w:sz="2" w:space="0" w:color="808080"/>
@@ -7738,25 +7643,6 @@
     </w:p>
     <w:p>
       <w:pPr>
-        <w:pStyle w:val="BodyText"/>
-        <w:bidi w:val="0"/>
-        <w:spacing w:before="0" w:after="100"/>
-        <w:jc w:val="both"/>
-        <w:rPr/>
-      </w:pPr>
-      <w:r>
-        <w:rPr>
-          <w:rStyle w:val="Strong"/>
-        </w:rPr>
-        <w:t>Estado:</w:t>
-      </w:r>
-      <w:r>
-        <w:rPr/>
-        <w:t xml:space="preserve"> Completo / En revisión</w:t>
-      </w:r>
-    </w:p>
-    <w:p>
-      <w:pPr>
         <w:pStyle w:val="HorizontalLine"/>
         <w:pBdr>
           <w:bottom w:val="double" w:sz="2" w:space="0" w:color="808080"/>
@@ -8668,25 +8554,6 @@
     </w:p>
     <w:p>
       <w:pPr>
-        <w:pStyle w:val="BodyText"/>
-        <w:bidi w:val="0"/>
-        <w:spacing w:before="0" w:after="100"/>
-        <w:jc w:val="both"/>
-        <w:rPr/>
-      </w:pPr>
-      <w:r>
-        <w:rPr>
-          <w:rStyle w:val="Strong"/>
-        </w:rPr>
-        <w:t>Estado:</w:t>
-      </w:r>
-      <w:r>
-        <w:rPr/>
-        <w:t xml:space="preserve"> Completo / En revisión</w:t>
-      </w:r>
-    </w:p>
-    <w:p>
-      <w:pPr>
         <w:pStyle w:val="HorizontalLine"/>
         <w:pBdr>
           <w:bottom w:val="double" w:sz="2" w:space="0" w:color="808080"/>
@@ -9676,25 +9543,6 @@
       <w:r>
         <w:rPr/>
         <w:t>)</w:t>
-      </w:r>
-    </w:p>
-    <w:p>
-      <w:pPr>
-        <w:pStyle w:val="BodyText"/>
-        <w:bidi w:val="0"/>
-        <w:spacing w:before="0" w:after="100"/>
-        <w:jc w:val="both"/>
-        <w:rPr/>
-      </w:pPr>
-      <w:r>
-        <w:rPr>
-          <w:rStyle w:val="Strong"/>
-        </w:rPr>
-        <w:t>Estado:</w:t>
-      </w:r>
-      <w:r>
-        <w:rPr/>
-        <w:t xml:space="preserve"> Completo / Revisado</w:t>
       </w:r>
     </w:p>
     <w:p>
@@ -11382,25 +11230,6 @@
     </w:p>
     <w:p>
       <w:pPr>
-        <w:pStyle w:val="BodyText"/>
-        <w:bidi w:val="0"/>
-        <w:spacing w:before="0" w:after="100"/>
-        <w:jc w:val="both"/>
-        <w:rPr/>
-      </w:pPr>
-      <w:r>
-        <w:rPr>
-          <w:rStyle w:val="Strong"/>
-        </w:rPr>
-        <w:t>Estado:</w:t>
-      </w:r>
-      <w:r>
-        <w:rPr/>
-        <w:t xml:space="preserve"> Completo / Revisado</w:t>
-      </w:r>
-    </w:p>
-    <w:p>
-      <w:pPr>
         <w:pStyle w:val="HorizontalLine"/>
         <w:pBdr>
           <w:bottom w:val="double" w:sz="2" w:space="0" w:color="808080"/>

</xml_diff>